<commit_message>
fix: limita paginas visiveis de profissionais
</commit_message>
<xml_diff>
--- a/docs/documentacao.docx
+++ b/docs/documentacao.docx
@@ -2,7 +2,7 @@
 <file path=word/document.xml><?xml version="1.0" encoding="utf-8"?>
 <w:document xmlns:w="http://schemas.openxmlformats.org/wordprocessingml/2006/main" xmlns:m="http://schemas.openxmlformats.org/officeDocument/2006/math" xmlns:r="http://schemas.openxmlformats.org/officeDocument/2006/relationships" xmlns:o="urn:schemas-microsoft-com:office:office" xmlns:v="urn:schemas-microsoft-com:vml" xmlns:w10="urn:schemas-microsoft-com:office:word" xmlns:a="http://schemas.openxmlformats.org/drawingml/2006/main" xmlns:pic="http://schemas.openxmlformats.org/drawingml/2006/picture" xmlns:wp="http://schemas.openxmlformats.org/drawingml/2006/wordprocessingDrawing">
   <w:body>
-    <w:bookmarkStart w:id="58" w:name="Xa5a5380f307c0840b6d64a5275bf7896751e194"/>
+    <w:bookmarkStart w:id="59" w:name="Xa5a5380f307c0840b6d64a5275bf7896751e194"/>
     <w:p>
       <w:pPr>
         <w:pStyle w:val="Heading1"/>
@@ -581,7 +581,7 @@
               <w:jc w:val="left"/>
             </w:pPr>
             <w:r>
-              <w:t xml:space="preserve">CRUD completo, filtros de busca, ativar/inativar</w:t>
+              <w:t xml:space="preserve">CRUD completo, filtros de busca, paginação, ativar/inativar</w:t>
             </w:r>
           </w:p>
         </w:tc>
@@ -655,7 +655,7 @@
               <w:jc w:val="left"/>
             </w:pPr>
             <w:r>
-              <w:t xml:space="preserve">CRUD completo, ativar/inativar, atualização via PUT</w:t>
+              <w:t xml:space="preserve">CRUD completo, ativar/inativar, atualização via PUT, paginação com janela limitada</w:t>
             </w:r>
           </w:p>
         </w:tc>
@@ -4778,7 +4778,7 @@
       </w:r>
     </w:p>
     <w:bookmarkEnd w:id="36"/>
-    <w:bookmarkStart w:id="42" w:name="componentes"/>
+    <w:bookmarkStart w:id="43" w:name="componentes"/>
     <w:p>
       <w:pPr>
         <w:pStyle w:val="Heading2"/>
@@ -4890,7 +4890,7 @@
         <w:pStyle w:val="Compact"/>
       </w:pPr>
       <w:r>
-        <w:t xml:space="preserve">Colunas: Nome, E-mail, CPF, Telefone, Status, Ações</w:t>
+        <w:t xml:space="preserve">Resumo do intervalo exibido e total de pacientes retornados pela API</w:t>
       </w:r>
     </w:p>
     <w:p>
@@ -4902,7 +4902,7 @@
         <w:pStyle w:val="Compact"/>
       </w:pPr>
       <w:r>
-        <w:t xml:space="preserve">Ações: Ver, Editar, Inativar para ativos e Ativar para inativos</w:t>
+        <w:t xml:space="preserve">Seletor de itens por página com opções 5, 10, 20 e 50</w:t>
       </w:r>
     </w:p>
     <w:p>
@@ -4914,7 +4914,7 @@
         <w:pStyle w:val="Compact"/>
       </w:pPr>
       <w:r>
-        <w:t xml:space="preserve">Diálogo de confirmação inline para ativação e inativação</w:t>
+        <w:t xml:space="preserve">Navegação por página com botões anterior/próxima e janela de até 5 páginas visíveis</w:t>
       </w:r>
     </w:p>
     <w:p>
@@ -4926,6 +4926,42 @@
         <w:pStyle w:val="Compact"/>
       </w:pPr>
       <w:r>
+        <w:t xml:space="preserve">Colunas: Nome, E-mail, CPF, Telefone, Status, Ações</w:t>
+      </w:r>
+    </w:p>
+    <w:p>
+      <w:pPr>
+        <w:numPr>
+          <w:ilvl w:val="0"/>
+          <w:numId w:val="1002"/>
+        </w:numPr>
+        <w:pStyle w:val="Compact"/>
+      </w:pPr>
+      <w:r>
+        <w:t xml:space="preserve">Ações: Ver, Editar, Inativar para ativos e Ativar para inativos</w:t>
+      </w:r>
+    </w:p>
+    <w:p>
+      <w:pPr>
+        <w:numPr>
+          <w:ilvl w:val="0"/>
+          <w:numId w:val="1002"/>
+        </w:numPr>
+        <w:pStyle w:val="Compact"/>
+      </w:pPr>
+      <w:r>
+        <w:t xml:space="preserve">Diálogo de confirmação inline para ativação e inativação</w:t>
+      </w:r>
+    </w:p>
+    <w:p>
+      <w:pPr>
+        <w:numPr>
+          <w:ilvl w:val="0"/>
+          <w:numId w:val="1002"/>
+        </w:numPr>
+        <w:pStyle w:val="Compact"/>
+      </w:pPr>
+      <w:r>
         <w:t xml:space="preserve">Tratamento de erros e estado de carregamento</w:t>
       </w:r>
     </w:p>
@@ -5094,7 +5130,7 @@
       </w:r>
     </w:p>
     <w:bookmarkEnd w:id="40"/>
-    <w:bookmarkStart w:id="41" w:name="confirmardialogcomponent-shared"/>
+    <w:bookmarkStart w:id="41" w:name="profissionallistcomponent"/>
     <w:p>
       <w:pPr>
         <w:pStyle w:val="Heading3"/>
@@ -5103,16 +5139,7 @@
         <w:rPr>
           <w:rStyle w:val="VerbatimChar"/>
         </w:rPr>
-        <w:t xml:space="preserve">ConfirmarDialogComponent</w:t>
-      </w:r>
-      <w:r>
-        <w:t xml:space="preserve"> </w:t>
-      </w:r>
-      <w:r>
-        <w:rPr>
-          <w:i/>
-        </w:rPr>
-        <w:t xml:space="preserve">(shared)</w:t>
+        <w:t xml:space="preserve">ProfissionalListComponent</w:t>
       </w:r>
     </w:p>
     <w:p>
@@ -5124,153 +5151,89 @@
         <w:pStyle w:val="Compact"/>
       </w:pPr>
       <w:r>
-        <w:t xml:space="preserve">Componente gerado, ainda não integrado (diálogos implementados inline nos componentes)</w:t>
-      </w:r>
-    </w:p>
-    <w:p>
-      <w:r>
-        <w:pict>
-          <v:rect style="width:0;height:1.5pt" o:hralign="center" o:hrstd="t" o:hr="t"/>
-        </w:pict>
+        <w:t xml:space="preserve">Tabela paginada de profissionais ativos</w:t>
+      </w:r>
+    </w:p>
+    <w:p>
+      <w:pPr>
+        <w:numPr>
+          <w:ilvl w:val="0"/>
+          <w:numId w:val="1005"/>
+        </w:numPr>
+        <w:pStyle w:val="Compact"/>
+      </w:pPr>
+      <w:r>
+        <w:t xml:space="preserve">Navegação por página com janela de até 5 páginas visíveis para evitar excesso de botões no DOM</w:t>
+      </w:r>
+    </w:p>
+    <w:p>
+      <w:pPr>
+        <w:numPr>
+          <w:ilvl w:val="0"/>
+          <w:numId w:val="1005"/>
+        </w:numPr>
+        <w:pStyle w:val="Compact"/>
+      </w:pPr>
+      <w:r>
+        <w:t xml:space="preserve">Colunas: Nome, E-mail, Contrato, % por Aula, Ações</w:t>
+      </w:r>
+    </w:p>
+    <w:p>
+      <w:pPr>
+        <w:numPr>
+          <w:ilvl w:val="0"/>
+          <w:numId w:val="1005"/>
+        </w:numPr>
+        <w:pStyle w:val="Compact"/>
+      </w:pPr>
+      <w:r>
+        <w:t xml:space="preserve">Ações: Ver, Editar e Inativar</w:t>
+      </w:r>
+    </w:p>
+    <w:p>
+      <w:pPr>
+        <w:numPr>
+          <w:ilvl w:val="0"/>
+          <w:numId w:val="1005"/>
+        </w:numPr>
+        <w:pStyle w:val="Compact"/>
+      </w:pPr>
+      <w:r>
+        <w:t xml:space="preserve">Diálogo de confirmação inline para inativação</w:t>
+      </w:r>
+    </w:p>
+    <w:p>
+      <w:pPr>
+        <w:numPr>
+          <w:ilvl w:val="0"/>
+          <w:numId w:val="1005"/>
+        </w:numPr>
+        <w:pStyle w:val="Compact"/>
+      </w:pPr>
+      <w:r>
+        <w:t xml:space="preserve">Tratamento de erros e estado de carregamento</w:t>
       </w:r>
     </w:p>
     <w:bookmarkEnd w:id="41"/>
-    <w:bookmarkEnd w:id="42"/>
-    <w:bookmarkStart w:id="45" w:name="design-system"/>
-    <w:p>
-      <w:pPr>
-        <w:pStyle w:val="Heading2"/>
-      </w:pPr>
-      <w:r>
-        <w:t xml:space="preserve">Design System</w:t>
-      </w:r>
-    </w:p>
-    <w:p>
-      <w:pPr>
-        <w:pStyle w:val="FirstParagraph"/>
-      </w:pPr>
-      <w:r>
-        <w:t xml:space="preserve">Arquivo:</w:t>
-      </w:r>
-      <w:r>
-        <w:t xml:space="preserve"> </w:t>
-      </w:r>
-      <w:r>
-        <w:rPr>
-          <w:rStyle w:val="VerbatimChar"/>
-        </w:rPr>
-        <w:t xml:space="preserve">src/styles.scss</w:t>
-      </w:r>
-    </w:p>
-    <w:bookmarkStart w:id="43" w:name="variáveis-css-custom-properties"/>
+    <w:bookmarkStart w:id="42" w:name="confirmardialogcomponent-shared"/>
     <w:p>
       <w:pPr>
         <w:pStyle w:val="Heading3"/>
       </w:pPr>
       <w:r>
-        <w:t xml:space="preserve">Variáveis CSS (Custom Properties)</w:t>
-      </w:r>
-    </w:p>
-    <w:p>
-      <w:pPr>
-        <w:pStyle w:val="SourceCode"/>
-      </w:pPr>
-      <w:r>
-        <w:rPr>
-          <w:rStyle w:val="VerbatimChar"/>
-        </w:rPr>
-        <w:t xml:space="preserve">--primary:      #6c63ff   /* Roxo principal */</w:t>
-      </w:r>
-      <w:r>
-        <w:br/>
-      </w:r>
-      <w:r>
-        <w:rPr>
-          <w:rStyle w:val="VerbatimChar"/>
-        </w:rPr>
-        <w:t xml:space="preserve">--primary-dark: #574fd6</w:t>
-      </w:r>
-      <w:r>
-        <w:br/>
-      </w:r>
-      <w:r>
-        <w:rPr>
-          <w:rStyle w:val="VerbatimChar"/>
-        </w:rPr>
-        <w:t xml:space="preserve">--secondary:    #4caf50   /* Verde */</w:t>
-      </w:r>
-      <w:r>
-        <w:br/>
-      </w:r>
-      <w:r>
-        <w:rPr>
-          <w:rStyle w:val="VerbatimChar"/>
-        </w:rPr>
-        <w:t xml:space="preserve">--danger:       #e53935   /* Vermelho */</w:t>
-      </w:r>
-      <w:r>
-        <w:br/>
-      </w:r>
-      <w:r>
-        <w:rPr>
-          <w:rStyle w:val="VerbatimChar"/>
-        </w:rPr>
-        <w:t xml:space="preserve">--text:         #333</w:t>
-      </w:r>
-      <w:r>
-        <w:br/>
-      </w:r>
-      <w:r>
-        <w:rPr>
-          <w:rStyle w:val="VerbatimChar"/>
-        </w:rPr>
-        <w:t xml:space="preserve">--text-light:   #666</w:t>
-      </w:r>
-      <w:r>
-        <w:br/>
-      </w:r>
-      <w:r>
-        <w:rPr>
-          <w:rStyle w:val="VerbatimChar"/>
-        </w:rPr>
-        <w:t xml:space="preserve">--border:       #ddd</w:t>
-      </w:r>
-      <w:r>
-        <w:br/>
-      </w:r>
-      <w:r>
-        <w:rPr>
-          <w:rStyle w:val="VerbatimChar"/>
-        </w:rPr>
-        <w:t xml:space="preserve">--bg:           #f5f5f5</w:t>
-      </w:r>
-      <w:r>
-        <w:br/>
-      </w:r>
-      <w:r>
-        <w:rPr>
-          <w:rStyle w:val="VerbatimChar"/>
-        </w:rPr>
-        <w:t xml:space="preserve">--white:        #fff</w:t>
-      </w:r>
-      <w:r>
-        <w:br/>
-      </w:r>
-      <w:r>
-        <w:rPr>
-          <w:rStyle w:val="VerbatimChar"/>
-        </w:rPr>
-        <w:t xml:space="preserve">--radius:       6px</w:t>
-      </w:r>
-    </w:p>
-    <w:bookmarkEnd w:id="43"/>
-    <w:bookmarkStart w:id="44" w:name="elementos-estilizados-globalmente"/>
-    <w:p>
-      <w:pPr>
-        <w:pStyle w:val="Heading3"/>
-      </w:pPr>
-      <w:r>
-        <w:t xml:space="preserve">Elementos Estilizados Globalmente</w:t>
+        <w:rPr>
+          <w:rStyle w:val="VerbatimChar"/>
+        </w:rPr>
+        <w:t xml:space="preserve">ConfirmarDialogComponent</w:t>
+      </w:r>
+      <w:r>
+        <w:t xml:space="preserve"> </w:t>
+      </w:r>
+      <w:r>
+        <w:rPr>
+          <w:i/>
+        </w:rPr>
+        <w:t xml:space="preserve">(shared)</w:t>
       </w:r>
     </w:p>
     <w:p>
@@ -5282,79 +5245,7 @@
         <w:pStyle w:val="Compact"/>
       </w:pPr>
       <w:r>
-        <w:t xml:space="preserve">Navbar</w:t>
-      </w:r>
-    </w:p>
-    <w:p>
-      <w:pPr>
-        <w:numPr>
-          <w:ilvl w:val="0"/>
-          <w:numId w:val="1006"/>
-        </w:numPr>
-        <w:pStyle w:val="Compact"/>
-      </w:pPr>
-      <w:r>
-        <w:t xml:space="preserve">Botões: primary, secondary, danger, outline</w:t>
-      </w:r>
-    </w:p>
-    <w:p>
-      <w:pPr>
-        <w:numPr>
-          <w:ilvl w:val="0"/>
-          <w:numId w:val="1006"/>
-        </w:numPr>
-        <w:pStyle w:val="Compact"/>
-      </w:pPr>
-      <w:r>
-        <w:t xml:space="preserve">Tabela com cabeçalho roxo e hover</w:t>
-      </w:r>
-    </w:p>
-    <w:p>
-      <w:pPr>
-        <w:numPr>
-          <w:ilvl w:val="0"/>
-          <w:numId w:val="1006"/>
-        </w:numPr>
-        <w:pStyle w:val="Compact"/>
-      </w:pPr>
-      <w:r>
-        <w:t xml:space="preserve">Formulários com seções e validação visual</w:t>
-      </w:r>
-    </w:p>
-    <w:p>
-      <w:pPr>
-        <w:numPr>
-          <w:ilvl w:val="0"/>
-          <w:numId w:val="1006"/>
-        </w:numPr>
-        <w:pStyle w:val="Compact"/>
-      </w:pPr>
-      <w:r>
-        <w:t xml:space="preserve">Cards de detalhe em grid</w:t>
-      </w:r>
-    </w:p>
-    <w:p>
-      <w:pPr>
-        <w:numPr>
-          <w:ilvl w:val="0"/>
-          <w:numId w:val="1006"/>
-        </w:numPr>
-        <w:pStyle w:val="Compact"/>
-      </w:pPr>
-      <w:r>
-        <w:t xml:space="preserve">Diálogos com overlay</w:t>
-      </w:r>
-    </w:p>
-    <w:p>
-      <w:pPr>
-        <w:numPr>
-          <w:ilvl w:val="0"/>
-          <w:numId w:val="1006"/>
-        </w:numPr>
-        <w:pStyle w:val="Compact"/>
-      </w:pPr>
-      <w:r>
-        <w:t xml:space="preserve">Paginação</w:t>
+        <w:t xml:space="preserve">Componente gerado, ainda não integrado (diálogos implementados inline nos componentes)</w:t>
       </w:r>
     </w:p>
     <w:p>
@@ -5364,77 +5255,227 @@
         </w:pict>
       </w:r>
     </w:p>
+    <w:bookmarkEnd w:id="42"/>
+    <w:bookmarkEnd w:id="43"/>
+    <w:bookmarkStart w:id="46" w:name="design-system"/>
+    <w:p>
+      <w:pPr>
+        <w:pStyle w:val="Heading2"/>
+      </w:pPr>
+      <w:r>
+        <w:t xml:space="preserve">Design System</w:t>
+      </w:r>
+    </w:p>
+    <w:p>
+      <w:pPr>
+        <w:pStyle w:val="FirstParagraph"/>
+      </w:pPr>
+      <w:r>
+        <w:t xml:space="preserve">Arquivo:</w:t>
+      </w:r>
+      <w:r>
+        <w:t xml:space="preserve"> </w:t>
+      </w:r>
+      <w:r>
+        <w:rPr>
+          <w:rStyle w:val="VerbatimChar"/>
+        </w:rPr>
+        <w:t xml:space="preserve">src/styles.scss</w:t>
+      </w:r>
+    </w:p>
+    <w:bookmarkStart w:id="44" w:name="variáveis-css-custom-properties"/>
+    <w:p>
+      <w:pPr>
+        <w:pStyle w:val="Heading3"/>
+      </w:pPr>
+      <w:r>
+        <w:t xml:space="preserve">Variáveis CSS (Custom Properties)</w:t>
+      </w:r>
+    </w:p>
+    <w:p>
+      <w:pPr>
+        <w:pStyle w:val="SourceCode"/>
+      </w:pPr>
+      <w:r>
+        <w:rPr>
+          <w:rStyle w:val="VerbatimChar"/>
+        </w:rPr>
+        <w:t xml:space="preserve">--primary:      #6c63ff   /* Roxo principal */</w:t>
+      </w:r>
+      <w:r>
+        <w:br/>
+      </w:r>
+      <w:r>
+        <w:rPr>
+          <w:rStyle w:val="VerbatimChar"/>
+        </w:rPr>
+        <w:t xml:space="preserve">--primary-dark: #574fd6</w:t>
+      </w:r>
+      <w:r>
+        <w:br/>
+      </w:r>
+      <w:r>
+        <w:rPr>
+          <w:rStyle w:val="VerbatimChar"/>
+        </w:rPr>
+        <w:t xml:space="preserve">--secondary:    #4caf50   /* Verde */</w:t>
+      </w:r>
+      <w:r>
+        <w:br/>
+      </w:r>
+      <w:r>
+        <w:rPr>
+          <w:rStyle w:val="VerbatimChar"/>
+        </w:rPr>
+        <w:t xml:space="preserve">--danger:       #e53935   /* Vermelho */</w:t>
+      </w:r>
+      <w:r>
+        <w:br/>
+      </w:r>
+      <w:r>
+        <w:rPr>
+          <w:rStyle w:val="VerbatimChar"/>
+        </w:rPr>
+        <w:t xml:space="preserve">--text:         #333</w:t>
+      </w:r>
+      <w:r>
+        <w:br/>
+      </w:r>
+      <w:r>
+        <w:rPr>
+          <w:rStyle w:val="VerbatimChar"/>
+        </w:rPr>
+        <w:t xml:space="preserve">--text-light:   #666</w:t>
+      </w:r>
+      <w:r>
+        <w:br/>
+      </w:r>
+      <w:r>
+        <w:rPr>
+          <w:rStyle w:val="VerbatimChar"/>
+        </w:rPr>
+        <w:t xml:space="preserve">--border:       #ddd</w:t>
+      </w:r>
+      <w:r>
+        <w:br/>
+      </w:r>
+      <w:r>
+        <w:rPr>
+          <w:rStyle w:val="VerbatimChar"/>
+        </w:rPr>
+        <w:t xml:space="preserve">--bg:           #f5f5f5</w:t>
+      </w:r>
+      <w:r>
+        <w:br/>
+      </w:r>
+      <w:r>
+        <w:rPr>
+          <w:rStyle w:val="VerbatimChar"/>
+        </w:rPr>
+        <w:t xml:space="preserve">--white:        #fff</w:t>
+      </w:r>
+      <w:r>
+        <w:br/>
+      </w:r>
+      <w:r>
+        <w:rPr>
+          <w:rStyle w:val="VerbatimChar"/>
+        </w:rPr>
+        <w:t xml:space="preserve">--radius:       6px</w:t>
+      </w:r>
+    </w:p>
     <w:bookmarkEnd w:id="44"/>
-    <w:bookmarkEnd w:id="45"/>
-    <w:bookmarkStart w:id="46" w:name="scripts-disponíveis"/>
-    <w:p>
-      <w:pPr>
-        <w:pStyle w:val="Heading2"/>
-      </w:pPr>
-      <w:r>
-        <w:t xml:space="preserve">Scripts Disponíveis</w:t>
-      </w:r>
-    </w:p>
-    <w:p>
-      <w:pPr>
-        <w:pStyle w:val="SourceCode"/>
-      </w:pPr>
-      <w:r>
-        <w:rPr>
-          <w:rStyle w:val="ExtensionTok"/>
-        </w:rPr>
-        <w:t xml:space="preserve">npm</w:t>
-      </w:r>
-      <w:r>
-        <w:rPr>
-          <w:rStyle w:val="NormalTok"/>
-        </w:rPr>
-        <w:t xml:space="preserve"> start        # Servidor de desenvolvimento em http://localhost:4200</w:t>
-      </w:r>
-      <w:r>
-        <w:br/>
-      </w:r>
-      <w:r>
-        <w:rPr>
-          <w:rStyle w:val="ExtensionTok"/>
-        </w:rPr>
-        <w:t xml:space="preserve">npm</w:t>
-      </w:r>
-      <w:r>
-        <w:rPr>
-          <w:rStyle w:val="NormalTok"/>
-        </w:rPr>
-        <w:t xml:space="preserve"> run build    # Build de produção em dist/carlessopilatesfe</w:t>
-      </w:r>
-      <w:r>
-        <w:br/>
-      </w:r>
-      <w:r>
-        <w:rPr>
-          <w:rStyle w:val="ExtensionTok"/>
-        </w:rPr>
-        <w:t xml:space="preserve">npm</w:t>
-      </w:r>
-      <w:r>
-        <w:rPr>
-          <w:rStyle w:val="NormalTok"/>
-        </w:rPr>
-        <w:t xml:space="preserve"> run watch    # Build contínuo em modo desenvolvimento</w:t>
-      </w:r>
-      <w:r>
-        <w:br/>
-      </w:r>
-      <w:r>
-        <w:rPr>
-          <w:rStyle w:val="ExtensionTok"/>
-        </w:rPr>
-        <w:t xml:space="preserve">npm</w:t>
-      </w:r>
-      <w:r>
-        <w:rPr>
-          <w:rStyle w:val="NormalTok"/>
-        </w:rPr>
-        <w:t xml:space="preserve"> test         # Execução dos testes unitários (Karma/Jasmine)</w:t>
+    <w:bookmarkStart w:id="45" w:name="elementos-estilizados-globalmente"/>
+    <w:p>
+      <w:pPr>
+        <w:pStyle w:val="Heading3"/>
+      </w:pPr>
+      <w:r>
+        <w:t xml:space="preserve">Elementos Estilizados Globalmente</w:t>
+      </w:r>
+    </w:p>
+    <w:p>
+      <w:pPr>
+        <w:numPr>
+          <w:ilvl w:val="0"/>
+          <w:numId w:val="1007"/>
+        </w:numPr>
+        <w:pStyle w:val="Compact"/>
+      </w:pPr>
+      <w:r>
+        <w:t xml:space="preserve">Navbar</w:t>
+      </w:r>
+    </w:p>
+    <w:p>
+      <w:pPr>
+        <w:numPr>
+          <w:ilvl w:val="0"/>
+          <w:numId w:val="1007"/>
+        </w:numPr>
+        <w:pStyle w:val="Compact"/>
+      </w:pPr>
+      <w:r>
+        <w:t xml:space="preserve">Botões: primary, secondary, danger, outline</w:t>
+      </w:r>
+    </w:p>
+    <w:p>
+      <w:pPr>
+        <w:numPr>
+          <w:ilvl w:val="0"/>
+          <w:numId w:val="1007"/>
+        </w:numPr>
+        <w:pStyle w:val="Compact"/>
+      </w:pPr>
+      <w:r>
+        <w:t xml:space="preserve">Tabela com cabeçalho roxo e hover</w:t>
+      </w:r>
+    </w:p>
+    <w:p>
+      <w:pPr>
+        <w:numPr>
+          <w:ilvl w:val="0"/>
+          <w:numId w:val="1007"/>
+        </w:numPr>
+        <w:pStyle w:val="Compact"/>
+      </w:pPr>
+      <w:r>
+        <w:t xml:space="preserve">Formulários com seções e validação visual</w:t>
+      </w:r>
+    </w:p>
+    <w:p>
+      <w:pPr>
+        <w:numPr>
+          <w:ilvl w:val="0"/>
+          <w:numId w:val="1007"/>
+        </w:numPr>
+        <w:pStyle w:val="Compact"/>
+      </w:pPr>
+      <w:r>
+        <w:t xml:space="preserve">Cards de detalhe em grid</w:t>
+      </w:r>
+    </w:p>
+    <w:p>
+      <w:pPr>
+        <w:numPr>
+          <w:ilvl w:val="0"/>
+          <w:numId w:val="1007"/>
+        </w:numPr>
+        <w:pStyle w:val="Compact"/>
+      </w:pPr>
+      <w:r>
+        <w:t xml:space="preserve">Diálogos com overlay</w:t>
+      </w:r>
+    </w:p>
+    <w:p>
+      <w:pPr>
+        <w:numPr>
+          <w:ilvl w:val="0"/>
+          <w:numId w:val="1007"/>
+        </w:numPr>
+        <w:pStyle w:val="Compact"/>
+      </w:pPr>
+      <w:r>
+        <w:t xml:space="preserve">Paginação</w:t>
       </w:r>
     </w:p>
     <w:p>
@@ -5444,8 +5485,88 @@
         </w:pict>
       </w:r>
     </w:p>
+    <w:bookmarkEnd w:id="45"/>
     <w:bookmarkEnd w:id="46"/>
-    <w:bookmarkStart w:id="47" w:name="configuração-de-build"/>
+    <w:bookmarkStart w:id="47" w:name="scripts-disponíveis"/>
+    <w:p>
+      <w:pPr>
+        <w:pStyle w:val="Heading2"/>
+      </w:pPr>
+      <w:r>
+        <w:t xml:space="preserve">Scripts Disponíveis</w:t>
+      </w:r>
+    </w:p>
+    <w:p>
+      <w:pPr>
+        <w:pStyle w:val="SourceCode"/>
+      </w:pPr>
+      <w:r>
+        <w:rPr>
+          <w:rStyle w:val="ExtensionTok"/>
+        </w:rPr>
+        <w:t xml:space="preserve">npm</w:t>
+      </w:r>
+      <w:r>
+        <w:rPr>
+          <w:rStyle w:val="NormalTok"/>
+        </w:rPr>
+        <w:t xml:space="preserve"> start        # Servidor de desenvolvimento em http://localhost:4200</w:t>
+      </w:r>
+      <w:r>
+        <w:br/>
+      </w:r>
+      <w:r>
+        <w:rPr>
+          <w:rStyle w:val="ExtensionTok"/>
+        </w:rPr>
+        <w:t xml:space="preserve">npm</w:t>
+      </w:r>
+      <w:r>
+        <w:rPr>
+          <w:rStyle w:val="NormalTok"/>
+        </w:rPr>
+        <w:t xml:space="preserve"> run build    # Build de produção em dist/carlessopilatesfe</w:t>
+      </w:r>
+      <w:r>
+        <w:br/>
+      </w:r>
+      <w:r>
+        <w:rPr>
+          <w:rStyle w:val="ExtensionTok"/>
+        </w:rPr>
+        <w:t xml:space="preserve">npm</w:t>
+      </w:r>
+      <w:r>
+        <w:rPr>
+          <w:rStyle w:val="NormalTok"/>
+        </w:rPr>
+        <w:t xml:space="preserve"> run watch    # Build contínuo em modo desenvolvimento</w:t>
+      </w:r>
+      <w:r>
+        <w:br/>
+      </w:r>
+      <w:r>
+        <w:rPr>
+          <w:rStyle w:val="ExtensionTok"/>
+        </w:rPr>
+        <w:t xml:space="preserve">npm</w:t>
+      </w:r>
+      <w:r>
+        <w:rPr>
+          <w:rStyle w:val="NormalTok"/>
+        </w:rPr>
+        <w:t xml:space="preserve"> test         # Execução dos testes unitários (Karma/Jasmine)</w:t>
+      </w:r>
+    </w:p>
+    <w:p>
+      <w:r>
+        <w:pict>
+          <v:rect style="width:0;height:1.5pt" o:hralign="center" o:hrstd="t" o:hr="t"/>
+        </w:pict>
+      </w:r>
+    </w:p>
+    <w:bookmarkEnd w:id="47"/>
+    <w:bookmarkStart w:id="48" w:name="configuração-de-build"/>
     <w:p>
       <w:pPr>
         <w:pStyle w:val="Heading2"/>
@@ -5657,8 +5778,8 @@
         </w:pict>
       </w:r>
     </w:p>
-    <w:bookmarkEnd w:id="47"/>
-    <w:bookmarkStart w:id="51" w:name="docker"/>
+    <w:bookmarkEnd w:id="48"/>
+    <w:bookmarkStart w:id="52" w:name="docker"/>
     <w:p>
       <w:pPr>
         <w:pStyle w:val="Heading2"/>
@@ -5861,7 +5982,7 @@
         </w:tc>
       </w:tr>
     </w:tbl>
-    <w:bookmarkStart w:id="48" w:name="execução-com-compose"/>
+    <w:bookmarkStart w:id="49" w:name="execução-com-compose"/>
     <w:p>
       <w:pPr>
         <w:pStyle w:val="Heading3"/>
@@ -5934,8 +6055,8 @@
         <w:t xml:space="preserve">.</w:t>
       </w:r>
     </w:p>
-    <w:bookmarkEnd w:id="48"/>
-    <w:bookmarkStart w:id="49" w:name="configurar-backend"/>
+    <w:bookmarkEnd w:id="49"/>
+    <w:bookmarkStart w:id="50" w:name="configurar-backend"/>
     <w:p>
       <w:pPr>
         <w:pStyle w:val="Heading3"/>
@@ -5973,8 +6094,8 @@
         <w:t xml:space="preserve"> compose up --build</w:t>
       </w:r>
     </w:p>
-    <w:bookmarkEnd w:id="49"/>
-    <w:bookmarkStart w:id="50" w:name="execução-com-docker"/>
+    <w:bookmarkEnd w:id="50"/>
+    <w:bookmarkStart w:id="51" w:name="execução-com-docker"/>
     <w:p>
       <w:pPr>
         <w:pStyle w:val="Heading3"/>
@@ -6097,9 +6218,9 @@
         </w:pict>
       </w:r>
     </w:p>
-    <w:bookmarkEnd w:id="50"/>
     <w:bookmarkEnd w:id="51"/>
-    <w:bookmarkStart w:id="54" w:name="testes-unitários"/>
+    <w:bookmarkEnd w:id="52"/>
+    <w:bookmarkStart w:id="55" w:name="testes-unitários"/>
     <w:p>
       <w:pPr>
         <w:pStyle w:val="Heading2"/>
@@ -6140,7 +6261,7 @@
         <w:t xml:space="preserve">npm test</w:t>
       </w:r>
     </w:p>
-    <w:bookmarkStart w:id="52" w:name="arquivos-de-teste"/>
+    <w:bookmarkStart w:id="53" w:name="arquivos-de-teste"/>
     <w:p>
       <w:pPr>
         <w:pStyle w:val="Heading3"/>
@@ -6310,7 +6431,34 @@
               <w:jc w:val="left"/>
             </w:pPr>
             <w:r>
-              <w:t xml:space="preserve">Carregamento, filtros, paginação, inativação, estados de erro</w:t>
+              <w:t xml:space="preserve">Carregamento, filtros, paginação, troca de tamanho de página, inativação, estados de erro</w:t>
+            </w:r>
+          </w:p>
+        </w:tc>
+      </w:tr>
+      <w:tr>
+        <w:tc>
+          <w:p>
+            <w:pPr>
+              <w:pStyle w:val="Compact"/>
+              <w:jc w:val="left"/>
+            </w:pPr>
+            <w:r>
+              <w:rPr>
+                <w:rStyle w:val="VerbatimChar"/>
+              </w:rPr>
+              <w:t xml:space="preserve">app/pages/profissionais/profissional-list/profissional-list.component.spec.ts</w:t>
+            </w:r>
+          </w:p>
+        </w:tc>
+        <w:tc>
+          <w:p>
+            <w:pPr>
+              <w:pStyle w:val="Compact"/>
+              <w:jc w:val="left"/>
+            </w:pPr>
+            <w:r>
+              <w:t xml:space="preserve">Carregamento, inativação, estados de erro e janela limitada de páginas visíveis</w:t>
             </w:r>
           </w:p>
         </w:tc>
@@ -6370,209 +6518,14 @@
         </w:tc>
       </w:tr>
     </w:tbl>
-    <w:bookmarkEnd w:id="52"/>
-    <w:bookmarkStart w:id="53" w:name="estratégia-de-mocking"/>
+    <w:bookmarkEnd w:id="53"/>
+    <w:bookmarkStart w:id="54" w:name="estratégia-de-mocking"/>
     <w:p>
       <w:pPr>
         <w:pStyle w:val="Heading3"/>
       </w:pPr>
       <w:r>
         <w:t xml:space="preserve">Estratégia de mocking</w:t>
-      </w:r>
-    </w:p>
-    <w:p>
-      <w:pPr>
-        <w:numPr>
-          <w:ilvl w:val="0"/>
-          <w:numId w:val="1007"/>
-        </w:numPr>
-        <w:pStyle w:val="Compact"/>
-      </w:pPr>
-      <w:r>
-        <w:rPr>
-          <w:b/>
-        </w:rPr>
-        <w:t xml:space="preserve">Serviço HTTP:</w:t>
-      </w:r>
-      <w:r>
-        <w:t xml:space="preserve"> </w:t>
-      </w:r>
-      <w:r>
-        <w:rPr>
-          <w:rStyle w:val="VerbatimChar"/>
-        </w:rPr>
-        <w:t xml:space="preserve">HttpClientTestingModule</w:t>
-      </w:r>
-      <w:r>
-        <w:t xml:space="preserve"> </w:t>
-      </w:r>
-      <w:r>
-        <w:t xml:space="preserve">+</w:t>
-      </w:r>
-      <w:r>
-        <w:t xml:space="preserve"> </w:t>
-      </w:r>
-      <w:r>
-        <w:rPr>
-          <w:rStyle w:val="VerbatimChar"/>
-        </w:rPr>
-        <w:t xml:space="preserve">HttpTestingController</w:t>
-      </w:r>
-      <w:r>
-        <w:t xml:space="preserve"> </w:t>
-      </w:r>
-      <w:r>
-        <w:t xml:space="preserve">nos testes de serviço</w:t>
-      </w:r>
-    </w:p>
-    <w:p>
-      <w:pPr>
-        <w:numPr>
-          <w:ilvl w:val="0"/>
-          <w:numId w:val="1007"/>
-        </w:numPr>
-        <w:pStyle w:val="Compact"/>
-      </w:pPr>
-      <w:r>
-        <w:rPr>
-          <w:b/>
-        </w:rPr>
-        <w:t xml:space="preserve">PacienteService nos componentes:</w:t>
-      </w:r>
-      <w:r>
-        <w:t xml:space="preserve"> </w:t>
-      </w:r>
-      <w:r>
-        <w:rPr>
-          <w:rStyle w:val="VerbatimChar"/>
-        </w:rPr>
-        <w:t xml:space="preserve">jasmine.createSpyObj</w:t>
-      </w:r>
-      <w:r>
-        <w:t xml:space="preserve"> </w:t>
-      </w:r>
-      <w:r>
-        <w:t xml:space="preserve">com retorno via</w:t>
-      </w:r>
-      <w:r>
-        <w:t xml:space="preserve"> </w:t>
-      </w:r>
-      <w:r>
-        <w:rPr>
-          <w:rStyle w:val="VerbatimChar"/>
-        </w:rPr>
-        <w:t xml:space="preserve">of()</w:t>
-      </w:r>
-      <w:r>
-        <w:t xml:space="preserve"> </w:t>
-      </w:r>
-      <w:r>
-        <w:t xml:space="preserve">ou</w:t>
-      </w:r>
-      <w:r>
-        <w:t xml:space="preserve"> </w:t>
-      </w:r>
-      <w:r>
-        <w:rPr>
-          <w:rStyle w:val="VerbatimChar"/>
-        </w:rPr>
-        <w:t xml:space="preserve">throwError()</w:t>
-      </w:r>
-    </w:p>
-    <w:p>
-      <w:pPr>
-        <w:numPr>
-          <w:ilvl w:val="0"/>
-          <w:numId w:val="1007"/>
-        </w:numPr>
-        <w:pStyle w:val="Compact"/>
-      </w:pPr>
-      <w:r>
-        <w:rPr>
-          <w:b/>
-        </w:rPr>
-        <w:t xml:space="preserve">Router:</w:t>
-      </w:r>
-      <w:r>
-        <w:t xml:space="preserve"> </w:t>
-      </w:r>
-      <w:r>
-        <w:rPr>
-          <w:rStyle w:val="VerbatimChar"/>
-        </w:rPr>
-        <w:t xml:space="preserve">RouterTestingModule</w:t>
-      </w:r>
-      <w:r>
-        <w:t xml:space="preserve"> </w:t>
-      </w:r>
-      <w:r>
-        <w:t xml:space="preserve">+</w:t>
-      </w:r>
-      <w:r>
-        <w:t xml:space="preserve"> </w:t>
-      </w:r>
-      <w:r>
-        <w:rPr>
-          <w:rStyle w:val="VerbatimChar"/>
-        </w:rPr>
-        <w:t xml:space="preserve">spyOn(router, 'navigate')</w:t>
-      </w:r>
-    </w:p>
-    <w:p>
-      <w:pPr>
-        <w:numPr>
-          <w:ilvl w:val="0"/>
-          <w:numId w:val="1007"/>
-        </w:numPr>
-        <w:pStyle w:val="Compact"/>
-      </w:pPr>
-      <w:r>
-        <w:rPr>
-          <w:b/>
-        </w:rPr>
-        <w:t xml:space="preserve">ActivatedRoute:</w:t>
-      </w:r>
-      <w:r>
-        <w:t xml:space="preserve"> </w:t>
-      </w:r>
-      <w:r>
-        <w:t xml:space="preserve">objeto literal com</w:t>
-      </w:r>
-      <w:r>
-        <w:t xml:space="preserve"> </w:t>
-      </w:r>
-      <w:r>
-        <w:rPr>
-          <w:rStyle w:val="VerbatimChar"/>
-        </w:rPr>
-        <w:t xml:space="preserve">snapshot.paramMap.get()</w:t>
-      </w:r>
-    </w:p>
-    <w:p>
-      <w:r>
-        <w:pict>
-          <v:rect style="width:0;height:1.5pt" o:hralign="center" o:hrstd="t" o:hr="t"/>
-        </w:pict>
-      </w:r>
-    </w:p>
-    <w:bookmarkEnd w:id="53"/>
-    <w:bookmarkEnd w:id="54"/>
-    <w:bookmarkStart w:id="57" w:name="status-do-projeto"/>
-    <w:p>
-      <w:pPr>
-        <w:pStyle w:val="Heading2"/>
-      </w:pPr>
-      <w:r>
-        <w:t xml:space="preserve">Status do Projeto</w:t>
-      </w:r>
-    </w:p>
-    <w:bookmarkStart w:id="55" w:name="implementado"/>
-    <w:p>
-      <w:pPr>
-        <w:pStyle w:val="Heading3"/>
-      </w:pPr>
-      <w:r>
-        <w:t xml:space="preserve">Implementado</w:t>
       </w:r>
     </w:p>
     <w:p>
@@ -6584,7 +6537,40 @@
         <w:pStyle w:val="Compact"/>
       </w:pPr>
       <w:r>
-        <w:t xml:space="preserve">CRUD completo de pacientes</w:t>
+        <w:rPr>
+          <w:b/>
+        </w:rPr>
+        <w:t xml:space="preserve">Serviço HTTP:</w:t>
+      </w:r>
+      <w:r>
+        <w:t xml:space="preserve"> </w:t>
+      </w:r>
+      <w:r>
+        <w:rPr>
+          <w:rStyle w:val="VerbatimChar"/>
+        </w:rPr>
+        <w:t xml:space="preserve">HttpClientTestingModule</w:t>
+      </w:r>
+      <w:r>
+        <w:t xml:space="preserve"> </w:t>
+      </w:r>
+      <w:r>
+        <w:t xml:space="preserve">+</w:t>
+      </w:r>
+      <w:r>
+        <w:t xml:space="preserve"> </w:t>
+      </w:r>
+      <w:r>
+        <w:rPr>
+          <w:rStyle w:val="VerbatimChar"/>
+        </w:rPr>
+        <w:t xml:space="preserve">HttpTestingController</w:t>
+      </w:r>
+      <w:r>
+        <w:t xml:space="preserve"> </w:t>
+      </w:r>
+      <w:r>
+        <w:t xml:space="preserve">nos testes de serviço</w:t>
       </w:r>
     </w:p>
     <w:p>
@@ -6596,7 +6582,49 @@
         <w:pStyle w:val="Compact"/>
       </w:pPr>
       <w:r>
-        <w:t xml:space="preserve">Filtros na listagem de pacientes por nome, e-mail, CPF, telefone e status</w:t>
+        <w:rPr>
+          <w:b/>
+        </w:rPr>
+        <w:t xml:space="preserve">PacienteService nos componentes:</w:t>
+      </w:r>
+      <w:r>
+        <w:t xml:space="preserve"> </w:t>
+      </w:r>
+      <w:r>
+        <w:rPr>
+          <w:rStyle w:val="VerbatimChar"/>
+        </w:rPr>
+        <w:t xml:space="preserve">jasmine.createSpyObj</w:t>
+      </w:r>
+      <w:r>
+        <w:t xml:space="preserve"> </w:t>
+      </w:r>
+      <w:r>
+        <w:t xml:space="preserve">com retorno via</w:t>
+      </w:r>
+      <w:r>
+        <w:t xml:space="preserve"> </w:t>
+      </w:r>
+      <w:r>
+        <w:rPr>
+          <w:rStyle w:val="VerbatimChar"/>
+        </w:rPr>
+        <w:t xml:space="preserve">of()</w:t>
+      </w:r>
+      <w:r>
+        <w:t xml:space="preserve"> </w:t>
+      </w:r>
+      <w:r>
+        <w:t xml:space="preserve">ou</w:t>
+      </w:r>
+      <w:r>
+        <w:t xml:space="preserve"> </w:t>
+      </w:r>
+      <w:r>
+        <w:rPr>
+          <w:rStyle w:val="VerbatimChar"/>
+        </w:rPr>
+        <w:t xml:space="preserve">throwError()</w:t>
       </w:r>
     </w:p>
     <w:p>
@@ -6608,7 +6636,34 @@
         <w:pStyle w:val="Compact"/>
       </w:pPr>
       <w:r>
-        <w:t xml:space="preserve">CRUD completo de profissionais com atualização via PUT</w:t>
+        <w:rPr>
+          <w:b/>
+        </w:rPr>
+        <w:t xml:space="preserve">Router:</w:t>
+      </w:r>
+      <w:r>
+        <w:t xml:space="preserve"> </w:t>
+      </w:r>
+      <w:r>
+        <w:rPr>
+          <w:rStyle w:val="VerbatimChar"/>
+        </w:rPr>
+        <w:t xml:space="preserve">RouterTestingModule</w:t>
+      </w:r>
+      <w:r>
+        <w:t xml:space="preserve"> </w:t>
+      </w:r>
+      <w:r>
+        <w:t xml:space="preserve">+</w:t>
+      </w:r>
+      <w:r>
+        <w:t xml:space="preserve"> </w:t>
+      </w:r>
+      <w:r>
+        <w:rPr>
+          <w:rStyle w:val="VerbatimChar"/>
+        </w:rPr>
+        <w:t xml:space="preserve">spyOn(router, 'navigate')</w:t>
       </w:r>
     </w:p>
     <w:p>
@@ -6620,161 +6675,52 @@
         <w:pStyle w:val="Compact"/>
       </w:pPr>
       <w:r>
-        <w:t xml:space="preserve">Paginação server-side</w:t>
-      </w:r>
-    </w:p>
-    <w:p>
-      <w:pPr>
-        <w:numPr>
-          <w:ilvl w:val="0"/>
-          <w:numId w:val="1008"/>
-        </w:numPr>
-        <w:pStyle w:val="Compact"/>
-      </w:pPr>
-      <w:r>
-        <w:t xml:space="preserve">Validação de formulários</w:t>
-      </w:r>
-    </w:p>
-    <w:p>
-      <w:pPr>
-        <w:numPr>
-          <w:ilvl w:val="0"/>
-          <w:numId w:val="1008"/>
-        </w:numPr>
-        <w:pStyle w:val="Compact"/>
-      </w:pPr>
-      <w:r>
-        <w:t xml:space="preserve">Feedback de erros e loading</w:t>
-      </w:r>
-    </w:p>
-    <w:p>
-      <w:pPr>
-        <w:numPr>
-          <w:ilvl w:val="0"/>
-          <w:numId w:val="1008"/>
-        </w:numPr>
-        <w:pStyle w:val="Compact"/>
-      </w:pPr>
-      <w:r>
-        <w:t xml:space="preserve">Integração com API REST (contratos alinhados com backend v2)</w:t>
-      </w:r>
-    </w:p>
-    <w:p>
-      <w:pPr>
-        <w:numPr>
-          <w:ilvl w:val="0"/>
-          <w:numId w:val="1008"/>
-        </w:numPr>
-        <w:pStyle w:val="Compact"/>
-      </w:pPr>
-      <w:r>
-        <w:t xml:space="preserve">Design responsivo</w:t>
-      </w:r>
-    </w:p>
-    <w:p>
-      <w:pPr>
-        <w:numPr>
-          <w:ilvl w:val="0"/>
-          <w:numId w:val="1008"/>
-        </w:numPr>
-        <w:pStyle w:val="Compact"/>
-      </w:pPr>
-      <w:r>
-        <w:t xml:space="preserve">Ativação e inativação de pacientes via PATCH</w:t>
-      </w:r>
-    </w:p>
-    <w:p>
-      <w:pPr>
-        <w:numPr>
-          <w:ilvl w:val="0"/>
-          <w:numId w:val="1008"/>
-        </w:numPr>
-        <w:pStyle w:val="Compact"/>
-      </w:pPr>
-      <w:r>
-        <w:t xml:space="preserve">E-mail mutável na edição (somente CPF é imutável)</w:t>
-      </w:r>
-    </w:p>
-    <w:p>
-      <w:pPr>
-        <w:numPr>
-          <w:ilvl w:val="0"/>
-          <w:numId w:val="1008"/>
-        </w:numPr>
-        <w:pStyle w:val="Compact"/>
-      </w:pPr>
-      <w:r>
-        <w:t xml:space="preserve">Módulo Planos: listagem, criação com seleção de dias e validação de frequência</w:t>
-      </w:r>
-    </w:p>
-    <w:p>
-      <w:pPr>
-        <w:numPr>
-          <w:ilvl w:val="0"/>
-          <w:numId w:val="1008"/>
-        </w:numPr>
-        <w:pStyle w:val="Compact"/>
-      </w:pPr>
-      <w:r>
-        <w:t xml:space="preserve">Módulo Pagamentos: listagem, criação e confirmação de pagamento (PAGO)</w:t>
-      </w:r>
-    </w:p>
-    <w:p>
-      <w:pPr>
-        <w:numPr>
-          <w:ilvl w:val="0"/>
-          <w:numId w:val="1008"/>
-        </w:numPr>
-        <w:pStyle w:val="Compact"/>
-      </w:pPr>
-      <w:r>
-        <w:t xml:space="preserve">Módulo Aulas: listagem e confirmação de presença</w:t>
-      </w:r>
-    </w:p>
-    <w:p>
-      <w:pPr>
-        <w:numPr>
-          <w:ilvl w:val="0"/>
-          <w:numId w:val="1008"/>
-        </w:numPr>
-        <w:pStyle w:val="Compact"/>
-      </w:pPr>
-      <w:r>
-        <w:t xml:space="preserve">Navegação contextual na tela de detalhe do paciente (Planos / Pagamentos / Aulas)</w:t>
-      </w:r>
-    </w:p>
-    <w:p>
-      <w:pPr>
-        <w:numPr>
-          <w:ilvl w:val="0"/>
-          <w:numId w:val="1008"/>
-        </w:numPr>
-        <w:pStyle w:val="Compact"/>
-      </w:pPr>
-      <w:r>
-        <w:t xml:space="preserve">Dockerfile, Docker Compose e Nginx para execução do frontend em container</w:t>
-      </w:r>
-    </w:p>
-    <w:p>
-      <w:pPr>
-        <w:numPr>
-          <w:ilvl w:val="0"/>
-          <w:numId w:val="1008"/>
-        </w:numPr>
-        <w:pStyle w:val="Compact"/>
-      </w:pPr>
-      <w:r>
-        <w:t xml:space="preserve">Testes unitários (serviço e todos os componentes de página)</w:t>
-      </w:r>
-    </w:p>
+        <w:rPr>
+          <w:b/>
+        </w:rPr>
+        <w:t xml:space="preserve">ActivatedRoute:</w:t>
+      </w:r>
+      <w:r>
+        <w:t xml:space="preserve"> </w:t>
+      </w:r>
+      <w:r>
+        <w:t xml:space="preserve">objeto literal com</w:t>
+      </w:r>
+      <w:r>
+        <w:t xml:space="preserve"> </w:t>
+      </w:r>
+      <w:r>
+        <w:rPr>
+          <w:rStyle w:val="VerbatimChar"/>
+        </w:rPr>
+        <w:t xml:space="preserve">snapshot.paramMap.get()</w:t>
+      </w:r>
+    </w:p>
+    <w:p>
+      <w:r>
+        <w:pict>
+          <v:rect style="width:0;height:1.5pt" o:hralign="center" o:hrstd="t" o:hr="t"/>
+        </w:pict>
+      </w:r>
+    </w:p>
+    <w:bookmarkEnd w:id="54"/>
     <w:bookmarkEnd w:id="55"/>
-    <w:bookmarkStart w:id="56" w:name="não-implementado-próximos-passos"/>
+    <w:bookmarkStart w:id="58" w:name="status-do-projeto"/>
+    <w:p>
+      <w:pPr>
+        <w:pStyle w:val="Heading2"/>
+      </w:pPr>
+      <w:r>
+        <w:t xml:space="preserve">Status do Projeto</w:t>
+      </w:r>
+    </w:p>
+    <w:bookmarkStart w:id="56" w:name="implementado"/>
     <w:p>
       <w:pPr>
         <w:pStyle w:val="Heading3"/>
       </w:pPr>
       <w:r>
-        <w:t xml:space="preserve">Não implementado / Próximos passos</w:t>
+        <w:t xml:space="preserve">Implementado</w:t>
       </w:r>
     </w:p>
     <w:p>
@@ -6786,7 +6732,7 @@
         <w:pStyle w:val="Compact"/>
       </w:pPr>
       <w:r>
-        <w:t xml:space="preserve">Autenticação e autorização</w:t>
+        <w:t xml:space="preserve">CRUD completo de pacientes</w:t>
       </w:r>
     </w:p>
     <w:p>
@@ -6798,7 +6744,7 @@
         <w:pStyle w:val="Compact"/>
       </w:pPr>
       <w:r>
-        <w:t xml:space="preserve">Configuração avançada de ambientes Angular, caso seja necessária no futuro</w:t>
+        <w:t xml:space="preserve">Filtros na listagem de pacientes por nome, e-mail, CPF, telefone e status</w:t>
       </w:r>
     </w:p>
     <w:p>
@@ -6810,22 +6756,7 @@
         <w:pStyle w:val="Compact"/>
       </w:pPr>
       <w:r>
-        <w:t xml:space="preserve">Componente</w:t>
-      </w:r>
-      <w:r>
-        <w:t xml:space="preserve"> </w:t>
-      </w:r>
-      <w:r>
-        <w:rPr>
-          <w:rStyle w:val="VerbatimChar"/>
-        </w:rPr>
-        <w:t xml:space="preserve">ConfirmarDialog</w:t>
-      </w:r>
-      <w:r>
-        <w:t xml:space="preserve"> </w:t>
-      </w:r>
-      <w:r>
-        <w:t xml:space="preserve">integrado</w:t>
+        <w:t xml:space="preserve">Paginação da consulta de pacientes com resumo, navegação anterior/próxima, janela de páginas e tamanho de página configurável</w:t>
       </w:r>
     </w:p>
     <w:p>
@@ -6837,7 +6768,7 @@
         <w:pStyle w:val="Compact"/>
       </w:pPr>
       <w:r>
-        <w:t xml:space="preserve">Testes E2E</w:t>
+        <w:t xml:space="preserve">CRUD completo de profissionais com atualização via PUT</w:t>
       </w:r>
     </w:p>
     <w:p>
@@ -6849,7 +6780,7 @@
         <w:pStyle w:val="Compact"/>
       </w:pPr>
       <w:r>
-        <w:t xml:space="preserve">Busca e filtros nas demais listagens</w:t>
+        <w:t xml:space="preserve">Paginação server-side em pacientes e profissionais, com janela limitada de páginas visíveis</w:t>
       </w:r>
     </w:p>
     <w:p>
@@ -6861,12 +6792,241 @@
         <w:pStyle w:val="Compact"/>
       </w:pPr>
       <w:r>
+        <w:t xml:space="preserve">Validação de formulários</w:t>
+      </w:r>
+    </w:p>
+    <w:p>
+      <w:pPr>
+        <w:numPr>
+          <w:ilvl w:val="0"/>
+          <w:numId w:val="1009"/>
+        </w:numPr>
+        <w:pStyle w:val="Compact"/>
+      </w:pPr>
+      <w:r>
+        <w:t xml:space="preserve">Feedback de erros e loading</w:t>
+      </w:r>
+    </w:p>
+    <w:p>
+      <w:pPr>
+        <w:numPr>
+          <w:ilvl w:val="0"/>
+          <w:numId w:val="1009"/>
+        </w:numPr>
+        <w:pStyle w:val="Compact"/>
+      </w:pPr>
+      <w:r>
+        <w:t xml:space="preserve">Integração com API REST (contratos alinhados com backend v2)</w:t>
+      </w:r>
+    </w:p>
+    <w:p>
+      <w:pPr>
+        <w:numPr>
+          <w:ilvl w:val="0"/>
+          <w:numId w:val="1009"/>
+        </w:numPr>
+        <w:pStyle w:val="Compact"/>
+      </w:pPr>
+      <w:r>
+        <w:t xml:space="preserve">Design responsivo</w:t>
+      </w:r>
+    </w:p>
+    <w:p>
+      <w:pPr>
+        <w:numPr>
+          <w:ilvl w:val="0"/>
+          <w:numId w:val="1009"/>
+        </w:numPr>
+        <w:pStyle w:val="Compact"/>
+      </w:pPr>
+      <w:r>
+        <w:t xml:space="preserve">Ativação e inativação de pacientes via PATCH</w:t>
+      </w:r>
+    </w:p>
+    <w:p>
+      <w:pPr>
+        <w:numPr>
+          <w:ilvl w:val="0"/>
+          <w:numId w:val="1009"/>
+        </w:numPr>
+        <w:pStyle w:val="Compact"/>
+      </w:pPr>
+      <w:r>
+        <w:t xml:space="preserve">E-mail mutável na edição (somente CPF é imutável)</w:t>
+      </w:r>
+    </w:p>
+    <w:p>
+      <w:pPr>
+        <w:numPr>
+          <w:ilvl w:val="0"/>
+          <w:numId w:val="1009"/>
+        </w:numPr>
+        <w:pStyle w:val="Compact"/>
+      </w:pPr>
+      <w:r>
+        <w:t xml:space="preserve">Módulo Planos: listagem, criação com seleção de dias e validação de frequência</w:t>
+      </w:r>
+    </w:p>
+    <w:p>
+      <w:pPr>
+        <w:numPr>
+          <w:ilvl w:val="0"/>
+          <w:numId w:val="1009"/>
+        </w:numPr>
+        <w:pStyle w:val="Compact"/>
+      </w:pPr>
+      <w:r>
+        <w:t xml:space="preserve">Módulo Pagamentos: listagem, criação e confirmação de pagamento (PAGO)</w:t>
+      </w:r>
+    </w:p>
+    <w:p>
+      <w:pPr>
+        <w:numPr>
+          <w:ilvl w:val="0"/>
+          <w:numId w:val="1009"/>
+        </w:numPr>
+        <w:pStyle w:val="Compact"/>
+      </w:pPr>
+      <w:r>
+        <w:t xml:space="preserve">Módulo Aulas: listagem e confirmação de presença</w:t>
+      </w:r>
+    </w:p>
+    <w:p>
+      <w:pPr>
+        <w:numPr>
+          <w:ilvl w:val="0"/>
+          <w:numId w:val="1009"/>
+        </w:numPr>
+        <w:pStyle w:val="Compact"/>
+      </w:pPr>
+      <w:r>
+        <w:t xml:space="preserve">Navegação contextual na tela de detalhe do paciente (Planos / Pagamentos / Aulas)</w:t>
+      </w:r>
+    </w:p>
+    <w:p>
+      <w:pPr>
+        <w:numPr>
+          <w:ilvl w:val="0"/>
+          <w:numId w:val="1009"/>
+        </w:numPr>
+        <w:pStyle w:val="Compact"/>
+      </w:pPr>
+      <w:r>
+        <w:t xml:space="preserve">Dockerfile, Docker Compose e Nginx para execução do frontend em container</w:t>
+      </w:r>
+    </w:p>
+    <w:p>
+      <w:pPr>
+        <w:numPr>
+          <w:ilvl w:val="0"/>
+          <w:numId w:val="1009"/>
+        </w:numPr>
+        <w:pStyle w:val="Compact"/>
+      </w:pPr>
+      <w:r>
+        <w:t xml:space="preserve">Testes unitários (serviço e todos os componentes de página)</w:t>
+      </w:r>
+    </w:p>
+    <w:bookmarkEnd w:id="56"/>
+    <w:bookmarkStart w:id="57" w:name="não-implementado-próximos-passos"/>
+    <w:p>
+      <w:pPr>
+        <w:pStyle w:val="Heading3"/>
+      </w:pPr>
+      <w:r>
+        <w:t xml:space="preserve">Não implementado / Próximos passos</w:t>
+      </w:r>
+    </w:p>
+    <w:p>
+      <w:pPr>
+        <w:numPr>
+          <w:ilvl w:val="0"/>
+          <w:numId w:val="1010"/>
+        </w:numPr>
+        <w:pStyle w:val="Compact"/>
+      </w:pPr>
+      <w:r>
+        <w:t xml:space="preserve">Autenticação e autorização</w:t>
+      </w:r>
+    </w:p>
+    <w:p>
+      <w:pPr>
+        <w:numPr>
+          <w:ilvl w:val="0"/>
+          <w:numId w:val="1010"/>
+        </w:numPr>
+        <w:pStyle w:val="Compact"/>
+      </w:pPr>
+      <w:r>
+        <w:t xml:space="preserve">Configuração avançada de ambientes Angular, caso seja necessária no futuro</w:t>
+      </w:r>
+    </w:p>
+    <w:p>
+      <w:pPr>
+        <w:numPr>
+          <w:ilvl w:val="0"/>
+          <w:numId w:val="1010"/>
+        </w:numPr>
+        <w:pStyle w:val="Compact"/>
+      </w:pPr>
+      <w:r>
+        <w:t xml:space="preserve">Componente</w:t>
+      </w:r>
+      <w:r>
+        <w:t xml:space="preserve"> </w:t>
+      </w:r>
+      <w:r>
+        <w:rPr>
+          <w:rStyle w:val="VerbatimChar"/>
+        </w:rPr>
+        <w:t xml:space="preserve">ConfirmarDialog</w:t>
+      </w:r>
+      <w:r>
+        <w:t xml:space="preserve"> </w:t>
+      </w:r>
+      <w:r>
+        <w:t xml:space="preserve">integrado</w:t>
+      </w:r>
+    </w:p>
+    <w:p>
+      <w:pPr>
+        <w:numPr>
+          <w:ilvl w:val="0"/>
+          <w:numId w:val="1010"/>
+        </w:numPr>
+        <w:pStyle w:val="Compact"/>
+      </w:pPr>
+      <w:r>
+        <w:t xml:space="preserve">Testes E2E</w:t>
+      </w:r>
+    </w:p>
+    <w:p>
+      <w:pPr>
+        <w:numPr>
+          <w:ilvl w:val="0"/>
+          <w:numId w:val="1010"/>
+        </w:numPr>
+        <w:pStyle w:val="Compact"/>
+      </w:pPr>
+      <w:r>
+        <w:t xml:space="preserve">Busca e filtros nas demais listagens</w:t>
+      </w:r>
+    </w:p>
+    <w:p>
+      <w:pPr>
+        <w:numPr>
+          <w:ilvl w:val="0"/>
+          <w:numId w:val="1010"/>
+        </w:numPr>
+        <w:pStyle w:val="Compact"/>
+      </w:pPr>
+      <w:r>
         <w:t xml:space="preserve">Animações e transições</w:t>
       </w:r>
     </w:p>
-    <w:bookmarkEnd w:id="56"/>
     <w:bookmarkEnd w:id="57"/>
     <w:bookmarkEnd w:id="58"/>
+    <w:bookmarkEnd w:id="59"/>
     <w:sectPr/>
   </w:body>
 </w:document>
@@ -7131,6 +7291,9 @@
     <w:abstractNumId w:val="991"/>
   </w:num>
   <w:num w:numId="1009">
+    <w:abstractNumId w:val="991"/>
+  </w:num>
+  <w:num w:numId="1010">
     <w:abstractNumId w:val="991"/>
   </w:num>
 </w:numbering>

</xml_diff>

<commit_message>
fix: ajusta endpoint do relatorio de nfse
</commit_message>
<xml_diff>
--- a/docs/documentacao.docx
+++ b/docs/documentacao.docx
@@ -6520,7 +6520,58 @@
         <w:t xml:space="preserve"> </w:t>
       </w:r>
       <w:r>
-        <w:t xml:space="preserve">e permite filtrar registros com ou sem nota anterior emitida. O resultado mostra total de registros, soma dos valores pagos e a tabela com nome, CPF/CNPJ, valor pago, competência, descrição do serviço, nota anterior emitida, data de pagamento e observações.</w:t>
+        <w:t xml:space="preserve">e permite filtrar registros com ou sem nota anterior emitida. O backend expõe</w:t>
+      </w:r>
+      <w:r>
+        <w:t xml:space="preserve"> </w:t>
+      </w:r>
+      <w:r>
+        <w:rPr>
+          <w:rStyle w:val="VerbatimChar"/>
+        </w:rPr>
+        <w:t xml:space="preserve">GET /api/relatorios/nfse</w:t>
+      </w:r>
+      <w:r>
+        <w:t xml:space="preserve">; por isso o serviço Angular chama</w:t>
+      </w:r>
+      <w:r>
+        <w:t xml:space="preserve"> </w:t>
+      </w:r>
+      <w:r>
+        <w:rPr>
+          <w:rStyle w:val="VerbatimChar"/>
+        </w:rPr>
+        <w:t xml:space="preserve">/api/api/relatorios/nfse</w:t>
+      </w:r>
+      <w:r>
+        <w:t xml:space="preserve">, preservando o prefixo</w:t>
+      </w:r>
+      <w:r>
+        <w:t xml:space="preserve"> </w:t>
+      </w:r>
+      <w:r>
+        <w:rPr>
+          <w:rStyle w:val="VerbatimChar"/>
+        </w:rPr>
+        <w:t xml:space="preserve">/api</w:t>
+      </w:r>
+      <w:r>
+        <w:t xml:space="preserve"> </w:t>
+      </w:r>
+      <w:r>
+        <w:t xml:space="preserve">do backend após o proxy local e o Nginx removerem o primeiro</w:t>
+      </w:r>
+      <w:r>
+        <w:t xml:space="preserve"> </w:t>
+      </w:r>
+      <w:r>
+        <w:rPr>
+          <w:rStyle w:val="VerbatimChar"/>
+        </w:rPr>
+        <w:t xml:space="preserve">/api</w:t>
+      </w:r>
+      <w:r>
+        <w:t xml:space="preserve">. O resultado mostra total de registros, soma dos valores pagos e a tabela com nome, CPF/CNPJ, valor pago, competência, descrição do serviço, nota anterior emitida, data de pagamento e observações.</w:t>
       </w:r>
     </w:p>
     <w:p>
@@ -6539,16 +6590,16 @@
         <w:rPr>
           <w:rStyle w:val="VerbatimChar"/>
         </w:rPr>
-        <w:t xml:space="preserve">GET /relatorios/nfse?competencia=04/2026</w:t>
-      </w:r>
-      <w:r>
-        <w:br/>
-      </w:r>
-      <w:r>
-        <w:rPr>
-          <w:rStyle w:val="VerbatimChar"/>
-        </w:rPr>
-        <w:t xml:space="preserve">GET /relatorios/nfse?competencia=04/2026&amp;notaAnteriorEmitida=false</w:t>
+        <w:t xml:space="preserve">GET /api/relatorios/nfse?competencia=04/2026</w:t>
+      </w:r>
+      <w:r>
+        <w:br/>
+      </w:r>
+      <w:r>
+        <w:rPr>
+          <w:rStyle w:val="VerbatimChar"/>
+        </w:rPr>
+        <w:t xml:space="preserve">GET /api/relatorios/nfse?competencia=04/2026&amp;notaAnteriorEmitida=false</w:t>
       </w:r>
     </w:p>
     <w:p>
@@ -6567,16 +6618,16 @@
         <w:rPr>
           <w:rStyle w:val="VerbatimChar"/>
         </w:rPr>
-        <w:t xml:space="preserve">GET /relatorios/nfse?competencia=04/2026&amp;formato=CSV</w:t>
-      </w:r>
-      <w:r>
-        <w:br/>
-      </w:r>
-      <w:r>
-        <w:rPr>
-          <w:rStyle w:val="VerbatimChar"/>
-        </w:rPr>
-        <w:t xml:space="preserve">GET /relatorios/nfse?competencia=04/2026&amp;formato=XLSX</w:t>
+        <w:t xml:space="preserve">GET /api/relatorios/nfse?competencia=04/2026&amp;formato=CSV</w:t>
+      </w:r>
+      <w:r>
+        <w:br/>
+      </w:r>
+      <w:r>
+        <w:rPr>
+          <w:rStyle w:val="VerbatimChar"/>
+        </w:rPr>
+        <w:t xml:space="preserve">GET /api/relatorios/nfse?competencia=04/2026&amp;formato=XLSX</w:t>
       </w:r>
     </w:p>
     <w:p>

</xml_diff>